<commit_message>
report: regenerate master TRINITY report — Bengaluru registered office, Karnataka state schemes
</commit_message>
<xml_diff>
--- a/outputs/goc/Project_TRINITY_Investor_Report.docx
+++ b/outputs/goc/Project_TRINITY_Investor_Report.docx
@@ -1769,7 +1769,7 @@
     <w:p/>
     <w:p>
       <w:r>
-        <w:t>Illustrative planning ranges only — actual funding depends on milestones, eligibility, investor appetite, and program requirements.</w:t>
+        <w:t>Illustrative planning ranges only — actual funding depends on milestones, eligibility, investor appetite, and program requirements. Company registered in Bengaluru, Karnataka.</w:t>
       </w:r>
     </w:p>
     <w:p>
@@ -1786,7 +1786,7 @@
     </w:p>
     <w:p>
       <w:r>
-        <w:t>IndiaAI Mission, Startup India, MeitY (TIDE 2.0 / SAMRIDH), ANRF, DST (SISFS, NIDHI-PRAYAS), Digital India, Semiconductor Mission (DLI/PLI), IN-SPACe, state startup missions. Each has distinct eligibility, equity-vs-grant, timeline, and milestone requirements.</w:t>
+        <w:t>IndiaAI Mission, Startup India, MeitY (TIDE 2.0 / SAMRIDH), ANRF, DST (SISFS, NIDHI-PRAYAS), Digital India, Semiconductor Mission (DLI/PLI), IN-SPACe, state startup missions (incl. Karnataka state schemes). Each has distinct eligibility, equity-vs-grant, timeline, and milestone requirements.</w:t>
       </w:r>
     </w:p>
     <w:p>
@@ -1893,6 +1893,14 @@
       </w:pPr>
       <w:r>
         <w:t>Founder: Saurabh Mandal — built the from-scratch SIA framework (tokenizer, transformer, multimodal, tools), 3 prior products (ASTRO, ALICE, SIA)</w:t>
+      </w:r>
+    </w:p>
+    <w:p>
+      <w:pPr>
+        <w:pStyle w:val="ListBullet"/>
+      </w:pPr>
+      <w:r>
+        <w:t>Legal entity: Indian Private Limited Company being incorporated via SPICe+, registered office in Bengaluru, Karnataka (India's AI talent and venture capital hub)</w:t>
       </w:r>
     </w:p>
     <w:p>

</xml_diff>